<commit_message>
modified for using a single drill bit case
</commit_message>
<xml_diff>
--- a/feed-rig/Construction_Guide.docx
+++ b/feed-rig/Construction_Guide.docx
@@ -1952,13 +1952,13 @@
           <w:p>
             <w:pPr/>
             <w:r>
-              <w:t xml:space="preserve">e.g. 17HS4401; 5 mm shaft </w:t>
+              <w:t xml:space="preserve">17HS15-1704S (already owned): 1.7 A, 5 mm D-shaft 20 </w:t>
             </w:r>
             <w:r>
               <w:rPr>
                 <w:b/>
               </w:rPr>
-              <w:t xml:space="preserve">at least 24 mm long</w:t>
+              <w:t xml:space="preserve">mm long</w:t>
             </w:r>
           </w:p>
         </w:tc>
@@ -2514,16 +2514,16 @@
         <w:t xml:space="preserve">plate_mode = "laser"</w:t>
       </w:r>
       <w:r>
-        <w:t xml:space="preserve"> for laser or CNC cutting (also set </w:t>
+        <w:t xml:space="preserve"> for the laser (the CNC uses its own side_plate_cnc_inner / side_plate_cnc_outline exports and ignores </w:t>
       </w:r>
       <w:r>
         <w:rPr>
           <w:rStyle w:val="CodeChar"/>
         </w:rPr>
-        <w:t xml:space="preserve">laser_kerf = 0</w:t>
-      </w:r>
-      <w:r>
-        <w:t xml:space="preserve"> for the CNC), or </w:t>
+        <w:t xml:space="preserve">laser_kerf</w:t>
+      </w:r>
+      <w:r>
+        <w:t xml:space="preserve">), or </w:t>
       </w:r>
       <w:r>
         <w:rPr>
@@ -2817,7 +2817,7 @@
         <w:t xml:space="preserve">CNC (for MDF or hardware-store plywood):</w:t>
       </w:r>
       <w:r>
-        <w:t xml:space="preserve"> saw the panel into blanks of about 185 × 195 mm first. Use a 1/8 in flat end mill, about 1 mm per pass, with tabs. Drill the small round holes afterwards: 3.5 mm for M3, 5.5 mm for M5.</w:t>
+        <w:t xml:space="preserve"> saw the panel into blanks of about 185 × 195 mm first. Use one 1/8 in (3.175 mm) flat end mill for everything, about 0.5–1 mm per pass, 300–500 mm/min. Import side_plate_cnc_inner.svg and side_plate_cnc_outline.svg at the same X/Y (they share a bounding box), set both to Luban's On the Path toolpath, cut the inner file first, then the outline with tabs. The paths are already offset for the bit, so every hole comes out at its true size, including the 3.4 mm M3 holes.</w:t>
       </w:r>
     </w:p>
     <w:p>
@@ -3941,7 +3941,7 @@
         <w:t xml:space="preserve">Pulleys:</w:t>
       </w:r>
       <w:r>
-        <w:t xml:space="preserve"> slide a 1 mm pulley shim, then an 8 mm-bore pulley, onto the long end of each driven shaft. Put the 5 mm-bore pulley on the motor shaft. Line up all three in one plane with a straightedge, then tighten the set screws onto the flats.</w:t>
+        <w:t xml:space="preserve"> slide a 1 mm pulley shim, then an 8 mm-bore pulley, onto the long end of each driven shaft. Put the 5 mm-bore pulley on the motor shaft. Mount all three pulleys hub first, so the set-screw hub faces the plate and the toothed part faces out. The motor's 20 mm shaft is only long enough for the hub this way; its tip ends about 3 mm inside the toothed part, which is fine. Set the motor pulley's screw on the shaft's flat. Line up all three in one plane with a straightedge, then tighten the set screws onto the flats.</w:t>
       </w:r>
     </w:p>
     <w:p>
@@ -6382,18 +6382,18 @@
           <w:p>
             <w:pPr/>
             <w:r>
-              <w:t xml:space="preserve">Motor shaft left after plate, gap and pulley</w:t>
-            </w:r>
-          </w:p>
-        </w:tc>
-        <w:tc>
-          <w:tcPr>
-            <w:tcW w:w="4680" w:type="dxa"/>
-          </w:tcPr>
-          <w:p>
-            <w:pPr/>
-            <w:r>
-              <w:t xml:space="preserve">0 mm: needs a 24 mm shaft</w:t>
+              <w:t xml:space="preserve">Motor pulley hub on the motor shaft</w:t>
+            </w:r>
+          </w:p>
+        </w:tc>
+        <w:tc>
+          <w:tcPr>
+            <w:tcW w:w="4680" w:type="dxa"/>
+          </w:tcPr>
+          <w:p>
+            <w:pPr/>
+            <w:r>
+              <w:t xml:space="preserve">5 mm to spare for the hub, teeth overhang 3 mm (20 mm shaft, hubs toward the plate)</w:t>
             </w:r>
           </w:p>
         </w:tc>

</xml_diff>

<commit_message>
modify bom and instructions
</commit_message>
<xml_diff>
--- a/feed-rig/Construction_Guide.docx
+++ b/feed-rig/Construction_Guide.docx
@@ -1085,7 +1085,7 @@
           <w:p>
             <w:pPr/>
             <w:r>
-              <w:t xml:space="preserve">157 × 167 mm from 6 mm plywood or 1/4 in MDF</w:t>
+              <w:t xml:space="preserve">157 × 167 mm; this build: 4 layers of 1/8 in basswood (one per 12 × 12 in sheet), laser-cut and glued into 2 plates. Alternatives: cut from 6 mm plywood or 1/4 in MDF</w:t>
             </w:r>
           </w:p>
         </w:tc>
@@ -1656,18 +1656,18 @@
           <w:p>
             <w:pPr/>
             <w:r>
-              <w:t xml:space="preserve">M3 × 10 socket head</w:t>
-            </w:r>
-          </w:p>
-        </w:tc>
-        <w:tc>
-          <w:tcPr>
-            <w:tcW w:w="3120" w:type="dxa"/>
-          </w:tcPr>
-          <w:p>
-            <w:pPr/>
-            <w:r>
-              <w:t xml:space="preserve">Motor 4, funnel 6, camera mount 4, spring anchors 4</w:t>
+              <w:t xml:space="preserve">M3 socket head, mixed lengths</w:t>
+            </w:r>
+          </w:p>
+        </w:tc>
+        <w:tc>
+          <w:tcPr>
+            <w:tcW w:w="3120" w:type="dxa"/>
+          </w:tcPr>
+          <w:p>
+            <w:pPr/>
+            <w:r>
+              <w:t xml:space="preserve">M3 × 10: funnel 6 + camera mount 4. M3 × 12: motor 4. M3 × 16: spring anchors 4 (from the inside, nut outside)</w:t>
             </w:r>
           </w:p>
         </w:tc>
@@ -3852,7 +3852,7 @@
         <w:t xml:space="preserve">Spring anchors:</w:t>
       </w:r>
       <w:r>
-        <w:t xml:space="preserve"> put an M3 × 10 through the second anchor hole of each row from the outside, with a nut inside. This is the default nip force; holes further out press harder.</w:t>
+        <w:t xml:space="preserve"> put an M3 × 16 through the second anchor hole of each row from the inside, and tighten a nut on the outside face. About 7 mm of shank sticks out for the spring to hook onto. This is the default nip force; holes further out press harder.</w:t>
       </w:r>
     </w:p>
     <w:p>
@@ -3923,7 +3923,7 @@
         <w:t xml:space="preserve">inside</w:t>
       </w:r>
       <w:r>
-        <w:t xml:space="preserve"> face of plate A, with its shaft through the large slotted hole. Fix it with four M3 × 10 through the slots, loosely.</w:t>
+        <w:t xml:space="preserve"> face of plate A, with its shaft through the large slotted hole. Fix it with four M3 × 12 through the slots, loosely (M3 × 10 is too short with laminated 6.35 mm plates).</w:t>
       </w:r>
     </w:p>
     <w:p>

</xml_diff>

<commit_message>
add files that are snapmaker compatible
</commit_message>
<xml_diff>
--- a/feed-rig/Construction_Guide.docx
+++ b/feed-rig/Construction_Guide.docx
@@ -2631,6 +2631,49 @@
     <w:p>
       <w:pPr/>
       <w:r>
+        <w:rPr>
+          <w:b/>
+        </w:rPr>
+        <w:t xml:space="preserve">For Snapmaker Luban, use the </w:t>
+      </w:r>
+      <w:r>
+        <w:rPr>
+          <w:rStyle w:val="CodeChar"/>
+          <w:b/>
+        </w:rPr>
+        <w:t xml:space="preserve">*_luban.svg</w:t>
+      </w:r>
+      <w:r>
+        <w:rPr>
+          <w:b/>
+        </w:rPr>
+        <w:t xml:space="preserve"> files</w:t>
+      </w:r>
+      <w:r>
+        <w:t xml:space="preserve"> (for example </w:t>
+      </w:r>
+      <w:r>
+        <w:rPr>
+          <w:rStyle w:val="CodeChar"/>
+        </w:rPr>
+        <w:t xml:space="preserve">stl/side_plate_laser_luban.svg</w:t>
+      </w:r>
+      <w:r>
+        <w:t xml:space="preserve">). They hold only black cut lines with no fill, at 1 unit = 1 mm. To regenerate every cut file after a change, run </w:t>
+      </w:r>
+      <w:r>
+        <w:rPr>
+          <w:rStyle w:val="CodeChar"/>
+        </w:rPr>
+        <w:t xml:space="preserve">tools/export_cut_files.sh</w:t>
+      </w:r>
+      <w:r>
+        <w:t xml:space="preserve">.</w:t>
+      </w:r>
+    </w:p>
+    <w:p>
+      <w:pPr/>
+      <w:r>
         <w:t xml:space="preserve">The files already in </w:t>
       </w:r>
       <w:r>
@@ -2817,7 +2860,7 @@
         <w:t xml:space="preserve">CNC (for MDF or hardware-store plywood):</w:t>
       </w:r>
       <w:r>
-        <w:t xml:space="preserve"> saw the panel into blanks of about 185 × 195 mm first. Use one 1/8 in (3.175 mm) flat end mill for everything, about 0.5–1 mm per pass, 300–500 mm/min. Import side_plate_cnc_inner.svg and side_plate_cnc_outline.svg at the same X/Y (they share a bounding box), set both to Luban's On the Path toolpath, cut the inner file first, then the outline with tabs. The paths are already offset for the bit, so every hole comes out at its true size, including the 3.4 mm M3 holes.</w:t>
+        <w:t xml:space="preserve"> saw the panel into blanks of about 185 × 195 mm first. Use one 1/8 in (3.175 mm) flat end mill for everything, about 0.5–1 mm per pass, 300–500 mm/min. Import side_plate_cnc_inner_luban.svg and side_plate_cnc_outline_luban.svg at the same X/Y (they share a bounding box), set both to Luban's On the Path toolpath, cut the inner file first, then the outline with tabs. The paths are already offset for the bit, so every hole comes out at its true size, including the 3.4 mm M3 holes.</w:t>
       </w:r>
     </w:p>
     <w:p>

</xml_diff>

<commit_message>
add some more cut files and stepper code
</commit_message>
<xml_diff>
--- a/feed-rig/Construction_Guide.docx
+++ b/feed-rig/Construction_Guide.docx
@@ -1993,18 +1993,18 @@
           <w:p>
             <w:pPr/>
             <w:r>
-              <w:t xml:space="preserve">TMC2209 driver</w:t>
-            </w:r>
-          </w:p>
-        </w:tc>
-        <w:tc>
-          <w:tcPr>
-            <w:tcW w:w="2340" w:type="dxa"/>
-          </w:tcPr>
-          <w:p>
-            <w:pPr/>
-            <w:r>
-              <w:t xml:space="preserve">standalone STEP/DIR module</w:t>
+              <w:t xml:space="preserve">DRV8825 driver</w:t>
+            </w:r>
+          </w:p>
+        </w:tc>
+        <w:tc>
+          <w:tcPr>
+            <w:tcW w:w="2340" w:type="dxa"/>
+          </w:tcPr>
+          <w:p>
+            <w:pPr/>
+            <w:r>
+              <w:t xml:space="preserve">STEP/DIR module with heatsink (ordered)</w:t>
             </w:r>
           </w:p>
         </w:tc>
@@ -4114,7 +4114,7 @@
     <w:p>
       <w:pPr/>
       <w:r>
-        <w:t xml:space="preserve">The stepper runs from a TMC2209 driver in standalone mode, controlled by </w:t>
+        <w:t xml:space="preserve">The stepper runs from a DRV8825 driver, controlled by a Raspberry Pi Pico running pico/stepper_test.py (or an Arduino running </w:t>
       </w:r>
       <w:r>
         <w:rPr>
@@ -4123,7 +4123,7 @@
         <w:t xml:space="preserve">feed_test.ino</w:t>
       </w:r>
       <w:r>
-        <w:t xml:space="preserve"> over USB serial. Wire everything with the 12 V supply unplugged.</w:t>
+        <w:t xml:space="preserve"> over USB serial; the steps below use the Arduino sketch, using Arduino pins D2–D4 and its 5 V pin in place of the Pico's GP2–GP4 and 3V3). Wire everything with the 12 V supply unplugged.</w:t>
       </w:r>
     </w:p>
     <w:p>
@@ -4158,7 +4158,7 @@
           <w:p>
             <w:pPr/>
             <w:r>
-              <w:t xml:space="preserve">TMC2209 pin</w:t>
+              <w:t xml:space="preserve">DRV8825 pin</w:t>
             </w:r>
           </w:p>
         </w:tc>
@@ -4206,7 +4206,7 @@
           <w:p>
             <w:pPr/>
             <w:r>
-              <w:t xml:space="preserve">Arduino pin 2</w:t>
+              <w:t xml:space="preserve">Pico GP2 (pin 4)</w:t>
             </w:r>
           </w:p>
         </w:tc>
@@ -4238,7 +4238,7 @@
           <w:p>
             <w:pPr/>
             <w:r>
-              <w:t xml:space="preserve">Arduino pin 3</w:t>
+              <w:t xml:space="preserve">Pico GP3 (pin 5)</w:t>
             </w:r>
           </w:p>
         </w:tc>
@@ -4270,42 +4270,112 @@
           <w:p>
             <w:pPr/>
             <w:r>
-              <w:t xml:space="preserve">Arduino pin 4</w:t>
-            </w:r>
-          </w:p>
-        </w:tc>
-        <w:tc>
-          <w:tcPr>
-            <w:tcW w:w="3120" w:type="dxa"/>
-          </w:tcPr>
-          <w:p>
-            <w:pPr/>
-            <w:r>
-              <w:t xml:space="preserve">Active low; the sketch pulls it low</w:t>
-            </w:r>
-          </w:p>
-        </w:tc>
-      </w:tr>
-      <w:tr>
-        <w:tc>
-          <w:tcPr>
-            <w:tcW w:w="3120" w:type="dxa"/>
-          </w:tcPr>
-          <w:p>
-            <w:pPr/>
-            <w:r>
-              <w:t xml:space="preserve">VIO (logic power)</w:t>
-            </w:r>
-          </w:p>
-        </w:tc>
-        <w:tc>
-          <w:tcPr>
-            <w:tcW w:w="3120" w:type="dxa"/>
-          </w:tcPr>
-          <w:p>
-            <w:pPr/>
-            <w:r>
-              <w:t xml:space="preserve">Arduino 5 V (3.3 V on an ESP32)</w:t>
+              <w:t xml:space="preserve">Pico GP4 (pin 6)</w:t>
+            </w:r>
+          </w:p>
+        </w:tc>
+        <w:tc>
+          <w:tcPr>
+            <w:tcW w:w="3120" w:type="dxa"/>
+          </w:tcPr>
+          <w:p>
+            <w:pPr/>
+            <w:r>
+              <w:t xml:space="preserve">Active low; the script pulls it low to run</w:t>
+            </w:r>
+          </w:p>
+        </w:tc>
+      </w:tr>
+      <w:tr>
+        <w:tc>
+          <w:tcPr>
+            <w:tcW w:w="3120" w:type="dxa"/>
+          </w:tcPr>
+          <w:p>
+            <w:pPr/>
+            <w:r>
+              <w:t xml:space="preserve">RESET and SLEEP</w:t>
+            </w:r>
+          </w:p>
+        </w:tc>
+        <w:tc>
+          <w:tcPr>
+            <w:tcW w:w="3120" w:type="dxa"/>
+          </w:tcPr>
+          <w:p>
+            <w:pPr/>
+            <w:r>
+              <w:t xml:space="preserve">Pico 3V3 OUT (pin 36)</w:t>
+            </w:r>
+          </w:p>
+        </w:tc>
+        <w:tc>
+          <w:tcPr>
+            <w:tcW w:w="3120" w:type="dxa"/>
+          </w:tcPr>
+          <w:p>
+            <w:pPr/>
+            <w:r>
+              <w:t xml:space="preserve">Both must be high, or the driver stays off</w:t>
+            </w:r>
+          </w:p>
+        </w:tc>
+      </w:tr>
+      <w:tr>
+        <w:tc>
+          <w:tcPr>
+            <w:tcW w:w="3120" w:type="dxa"/>
+          </w:tcPr>
+          <w:p>
+            <w:pPr/>
+            <w:r>
+              <w:t xml:space="preserve">M2</w:t>
+            </w:r>
+          </w:p>
+        </w:tc>
+        <w:tc>
+          <w:tcPr>
+            <w:tcW w:w="3120" w:type="dxa"/>
+          </w:tcPr>
+          <w:p>
+            <w:pPr/>
+            <w:r>
+              <w:t xml:space="preserve">Pico 3V3 OUT</w:t>
+            </w:r>
+          </w:p>
+        </w:tc>
+        <w:tc>
+          <w:tcPr>
+            <w:tcW w:w="3120" w:type="dxa"/>
+          </w:tcPr>
+          <w:p>
+            <w:pPr/>
+            <w:r>
+              <w:t xml:space="preserve">With M0 and M1 low: 1/16 microstepping</w:t>
+            </w:r>
+          </w:p>
+        </w:tc>
+      </w:tr>
+      <w:tr>
+        <w:tc>
+          <w:tcPr>
+            <w:tcW w:w="3120" w:type="dxa"/>
+          </w:tcPr>
+          <w:p>
+            <w:pPr/>
+            <w:r>
+              <w:t xml:space="preserve">M0, M1</w:t>
+            </w:r>
+          </w:p>
+        </w:tc>
+        <w:tc>
+          <w:tcPr>
+            <w:tcW w:w="3120" w:type="dxa"/>
+          </w:tcPr>
+          <w:p>
+            <w:pPr/>
+            <w:r>
+              <w:t xml:space="preserve">Pico GND</w:t>
             </w:r>
           </w:p>
         </w:tc>
@@ -4337,7 +4407,7 @@
           <w:p>
             <w:pPr/>
             <w:r>
-              <w:t xml:space="preserve">Arduino GND</w:t>
+              <w:t xml:space="preserve">Pico GND (pin 38)</w:t>
             </w:r>
           </w:p>
         </w:tc>
@@ -4361,7 +4431,7 @@
           <w:p>
             <w:pPr/>
             <w:r>
-              <w:t xml:space="preserve">VM</w:t>
+              <w:t xml:space="preserve">VMOT</w:t>
             </w:r>
           </w:p>
         </w:tc>
@@ -4383,7 +4453,7 @@
           <w:p>
             <w:pPr/>
             <w:r>
-              <w:t xml:space="preserve">100 µF capacitor across VM and GND, close to the driver, with correct polarity</w:t>
+              <w:t xml:space="preserve">100 µF capacitor across VMOT and GND, close to the driver, stripe to GND</w:t>
             </w:r>
           </w:p>
         </w:tc>
@@ -4439,7 +4509,7 @@
           <w:p>
             <w:pPr/>
             <w:r>
-              <w:t xml:space="preserve">Motor coil 1 / coil 2</w:t>
+              <w:t xml:space="preserve">Motor coil A / coil B</w:t>
             </w:r>
           </w:p>
         </w:tc>
@@ -4455,41 +4525,6 @@
           </w:p>
         </w:tc>
       </w:tr>
-      <w:tr>
-        <w:tc>
-          <w:tcPr>
-            <w:tcW w:w="3120" w:type="dxa"/>
-          </w:tcPr>
-          <w:p>
-            <w:pPr/>
-            <w:r>
-              <w:t xml:space="preserve">MS1, MS2</w:t>
-            </w:r>
-          </w:p>
-        </w:tc>
-        <w:tc>
-          <w:tcPr>
-            <w:tcW w:w="3120" w:type="dxa"/>
-          </w:tcPr>
-          <w:p>
-            <w:pPr/>
-            <w:r>
-              <w:t xml:space="preserve">GND</w:t>
-            </w:r>
-          </w:p>
-        </w:tc>
-        <w:tc>
-          <w:tcPr>
-            <w:tcW w:w="3120" w:type="dxa"/>
-          </w:tcPr>
-          <w:p>
-            <w:pPr/>
-            <w:r>
-              <w:t xml:space="preserve">8 microsteps on most boards; check yours</w:t>
-            </w:r>
-          </w:p>
-        </w:tc>
-      </w:tr>
     </w:tbl>
     <w:p>
       <w:pPr/>
@@ -4500,7 +4535,7 @@
         <w:t xml:space="preserve">Driver current:</w:t>
       </w:r>
       <w:r>
-        <w:t xml:space="preserve"> set it with the driver's potentiometer before connecting the motor, using your module's Vref table. Start around 0.8 A RMS; the 17HS4401 is rated 1.5 A, and this rig needs little torque.</w:t>
+        <w:t xml:space="preserve"> on most DRV8825 boards the current is 2 × Vref. Measure Vref between the trimmer and GND with the 12 V on, and set it to 0.45–0.5 V for 0.9–1.0 A; the 17HS15-1704S is rated 1.7 A and this rig needs little torque. Stick the heatsink on the driver chip. The DRV8825 whines more than a TMC2209; that is normal.</w:t>
       </w:r>
     </w:p>
     <w:p>
@@ -5914,7 +5949,7 @@
           <w:p>
             <w:pPr/>
             <w:r>
-              <w:t xml:space="preserve">21.95 at 8 microsteps</w:t>
+              <w:t xml:space="preserve">43.9 at 1/16 microstepping (DRV8825)</w:t>
             </w:r>
           </w:p>
         </w:tc>

</xml_diff>